<commit_message>
Pack v1.4 - guide collaborateur reecrit (contrat v2.1), fiche rentabilite et simulateur en grille v1.3
</commit_message>
<xml_diff>
--- a/docs/pack-commercial/commerciaux/FICHE-RENTABILITE_par-offre.docx
+++ b/docs/pack-commercial/commerciaux/FICHE-RENTABILITE_par-offre.docx
@@ -47,7 +47,7 @@
           <w:sz w:val="20"/>
           <w:szCs w:val="20"/>
         </w:rPr>
-        <w:t xml:space="preserve">Revenu net mensuel par formule, coût réel du commercial et marge — sur la première année (avec commission) puis en régime de croisière. Hypothèses : secrétaire payée 17 € HT par heure de forfait (taux de départ, négociable), coût technique 25 € / garage / mois, 60 % des garages engagés 12 mois. Grille commerciale v1.2 : une prime unique par garage, plus de prime de fidélité. Toutes ces hypothèses sont modifiables dans SIMULATEUR-COMMISSIONS.xlsx.</w:t>
+        <w:t>Revenu net mensuel par formule, coût réel du commercial et marge — sur la première année (avec commission) puis en régime de croisière. Hypothèses : secrétaire payée 17 € HT par heure de forfait (taux de départ, négociable), coût technique 25 € / garage / mois, 60 % des garages engagés 12 mois. Grille commerciale v1.3 (27/08/2026) : une prime unique par garage, versée dès la 1re mensualité avec engagement 12 mois (3e mensualité sinon), reprise si le garage arrête avant 3 mensualités ; montants identiques à la v1.2. Toutes ces hypothèses sont modifiables dans SIMULATEUR-COMMISSIONS.xlsx.</w:t>
       </w:r>
     </w:p>
     <w:p>
@@ -1769,7 +1769,7 @@
           <w:sz w:val="17"/>
           <w:szCs w:val="17"/>
         </w:rPr>
-        <w:t xml:space="preserve">Commission « lissée » = (prime + 60 % du bonus engagement) ÷ 12. En trésorerie, elle sort en une seule fois, vers le 2e mois.</w:t>
+        <w:t>Commission « lissée » = (prime + 60 % du bonus engagement) ÷ 12. En trésorerie, elle sort en une seule fois : dès la 1re mensualité encaissée si le garage est engagé, à la 3e sinon (v1.3). Non compris : le bonus de volume trimestriel (5 ventes hors ESSENTIEL → 255 €, 10 → 680 €), soit au plus ≈ 51 à 68 € par garage supplémentaire à ce rythme.</w:t>
       </w:r>
     </w:p>
     <w:p>
@@ -3154,7 +3154,7 @@
                 <w:sz w:val="20"/>
                 <w:szCs w:val="20"/>
               </w:rPr>
-              <w:t xml:space="preserve">Lecture. </w:t>
+              <w:t>Lecture. Un garage CONFORT vous laisse 495 € de marge par mois (secrétaire à 17 €/h). Avec la grille v1.3, le commercial en prend l'équivalent de 1,6 mois la première année (781 € en espérance), puis plus rien : sur 24 mois, ce garage vous rapporte 11 099 € de marge, dont 7 % sont partis en commission. La reprise de la prime avant 3 mensualités (v1.3) protège ce calcul contre les ventes qui ne tiennent pas.</w:t>
             </w:r>
             <w:r>
               <w:rPr>
@@ -3163,7 +3163,6 @@
                 <w:sz w:val="20"/>
                 <w:szCs w:val="20"/>
               </w:rPr>
-              <w:t xml:space="preserve">Un garage CONFORT vous laisse 495 € de marge par mois (secrétaire à 17 €/h). Avec la grille v1.2, le commercial en prend l'équivalent de 1,6 mois la première année (781 € en espérance), puis plus rien : sur 24 mois, ce garage vous rapporte 11 099 € de marge, dont 7 % sont partis en commission.</w:t>
             </w:r>
           </w:p>
         </w:tc>
@@ -4068,7 +4067,7 @@
           <w:sz w:val="26"/>
           <w:szCs w:val="26"/>
         </w:rPr>
-        <w:t xml:space="preserve">4. Grille v1.2 contre les grilles précédentes</w:t>
+        <w:t>4. Grille v1.3 (montants de la v1.2) contre les grilles précédentes</w:t>
       </w:r>
     </w:p>
     <w:tbl>
@@ -4235,7 +4234,7 @@
                 <w:sz w:val="18"/>
                 <w:szCs w:val="18"/>
               </w:rPr>
-              <w:t xml:space="preserve">Coût espéré v1.2</w:t>
+              <w:t>Coût espéré v1.2 / v1.3</w:t>
             </w:r>
           </w:p>
         </w:tc>
@@ -4307,7 +4306,7 @@
                 <w:sz w:val="18"/>
                 <w:szCs w:val="18"/>
               </w:rPr>
-              <w:t xml:space="preserve">Marge nette / mois v1.2</w:t>
+              <w:t>Marge nette / mois v1.2 / v1.3</w:t>
             </w:r>
           </w:p>
         </w:tc>
@@ -5210,7 +5209,7 @@
           <w:sz w:val="20"/>
           <w:szCs w:val="20"/>
         </w:rPr>
-        <w:t xml:space="preserve">Ce que change la v1.2. </w:t>
+        <w:t>Ce que changent la v1.2 puis la v1.3. La v1.2 a supprimé la prime de fidélité à 6 mois : la grille tient en une phrase (une prime par garage signé), donc plus de contestation possible sur « et ma prime de fidélité ? ». Sur un garage CONFORT, votre marge nette de première année passe de 404 à 430 €/mois (secrétaire à 17 €/h) ; sur 10 garages, l'économie est d'environ 3 200 € la première année par rapport à la v1.1. La v1.3 ne change pas les montants : elle avance la prime à la 1re mensualité quand le garage s'engage 12 mois (le commercial pousse l'engagement, qui sécurise votre chiffre d'affaires), la diffère à la 3e mensualité sinon, et la reprend si le garage arrête avant 3 mensualités — ce qui couvre le risque de la prime immédiate. Le commercial n'a pas d'intérêt financier à la durée au-delà : la fidélisation est le rôle de la secrétaire et du suivi IDEAFORMA.</w:t>
       </w:r>
       <w:r>
         <w:rPr>
@@ -5219,7 +5218,6 @@
           <w:sz w:val="20"/>
           <w:szCs w:val="20"/>
         </w:rPr>
-        <w:t xml:space="preserve">La prime de fidélité à 6 mois disparaît : la grille tient en une phrase (une prime par garage signé, acquise à la 2e mensualité), donc plus de contestation possible sur « et ma prime de fidélité ? ». Sur un garage CONFORT, votre marge nette de première année passe de 404 à 430 €/mois (secrétaire à 17 €/h) ; sur 10 garages, l'économie est d'environ 3 200 € la première année par rapport à la v1.1. En contrepartie, le commercial n'a plus d'intérêt financier direct à ce que le garage reste : c'est le rôle de la secrétaire et du suivi IDEAFORMA, pas le sien.</w:t>
       </w:r>
     </w:p>
     <w:p>

</xml_diff>